<commit_message>
Show the running checkpoints in the test data sheet, not just the final position
The sheet gave the balance sheet after opening capital and after the last step, so
a wrong figure in the middle had to be traced backwards. Each step now has its own
assets = liabilities + equity checkpoint, which is where the mistake was made:

    A7  opening capital   500,000.00
    A11 purchase          672,500.00
    A12 production        672,500.00
    A13 sale              683,750.00
    A14 receipt           683,750.00
    A15 supplier paid     511,250.00
    A17 payroll           484,250.00

All seven were replayed against the API before being written down, with the trial
balance at zero and the four integrity checks green at each one.

Co-authored-by: CommandCodeBot <noreply@commandcode.ai>
</commit_message>
<xml_diff>
--- a/TEST_DATA_SHEET.docx
+++ b/TEST_DATA_SHEET.docx
@@ -7185,6 +7185,694 @@
       </w:r>
       <w:r>
         <w:t>.</w:t>
+      </w:r>
+    </w:p>
+    <w:p>
+      <w:r>
+        <w:rPr>
+          <w:b/>
+        </w:rPr>
+        <w:t>Every step, checked as you go.</w:t>
+      </w:r>
+      <w:r>
+        <w:t xml:space="preserve"> If one of these is wrong, the mistake was made at that step — check it before carrying on. All figures are </w:t>
+      </w:r>
+      <w:r>
+        <w:rPr>
+          <w:rFonts w:ascii="Consolas" w:hAnsi="Consolas"/>
+          <w:color w:val="1D4ED8"/>
+          <w:sz w:val="19"/>
+        </w:rPr>
+        <w:t>assets = liabilities + equity</w:t>
+      </w:r>
+      <w:r>
+        <w:t xml:space="preserve">; the trial balance difference must be </w:t>
+      </w:r>
+      <w:r>
+        <w:rPr>
+          <w:rFonts w:ascii="Consolas" w:hAnsi="Consolas"/>
+          <w:color w:val="1D4ED8"/>
+          <w:sz w:val="19"/>
+        </w:rPr>
+        <w:t>0.00</w:t>
+      </w:r>
+      <w:r>
+        <w:t xml:space="preserve"> each time.</w:t>
+      </w:r>
+    </w:p>
+    <w:tbl>
+      <w:tblPr>
+        <w:tblStyle w:val="TableGrid"/>
+        <w:tblW w:type="auto" w:w="0"/>
+        <w:jc w:val="left"/>
+        <w:tblLook w:firstColumn="1" w:firstRow="1" w:lastColumn="0" w:lastRow="0" w:noHBand="0" w:noVBand="1" w:val="04A0"/>
+      </w:tblPr>
+      <w:tblGrid>
+        <w:gridCol w:w="2160"/>
+        <w:gridCol w:w="2160"/>
+        <w:gridCol w:w="2160"/>
+        <w:gridCol w:w="2160"/>
+      </w:tblGrid>
+      <w:tr>
+        <w:tc>
+          <w:tcPr>
+            <w:tcW w:type="dxa" w:w="2160"/>
+            <w:shd w:val="clear" w:color="auto" w:fill="F1F5F9"/>
+          </w:tcPr>
+          <w:p>
+            <w:r>
+              <w:rPr>
+                <w:b/>
+                <w:sz w:val="19"/>
+              </w:rPr>
+            </w:r>
+            <w:r>
+              <w:rPr>
+                <w:b/>
+                <w:sz w:val="19"/>
+              </w:rPr>
+              <w:t>After</w:t>
+            </w:r>
+          </w:p>
+        </w:tc>
+        <w:tc>
+          <w:tcPr>
+            <w:tcW w:type="dxa" w:w="2160"/>
+            <w:shd w:val="clear" w:color="auto" w:fill="F1F5F9"/>
+          </w:tcPr>
+          <w:p>
+            <w:r>
+              <w:rPr>
+                <w:b/>
+                <w:sz w:val="19"/>
+              </w:rPr>
+            </w:r>
+            <w:r>
+              <w:rPr>
+                <w:b/>
+                <w:sz w:val="19"/>
+              </w:rPr>
+              <w:t>Assets</w:t>
+            </w:r>
+          </w:p>
+        </w:tc>
+        <w:tc>
+          <w:tcPr>
+            <w:tcW w:type="dxa" w:w="2160"/>
+            <w:shd w:val="clear" w:color="auto" w:fill="F1F5F9"/>
+          </w:tcPr>
+          <w:p>
+            <w:r>
+              <w:rPr>
+                <w:b/>
+                <w:sz w:val="19"/>
+              </w:rPr>
+            </w:r>
+            <w:r>
+              <w:rPr>
+                <w:b/>
+                <w:sz w:val="19"/>
+              </w:rPr>
+              <w:t>L + E</w:t>
+            </w:r>
+          </w:p>
+        </w:tc>
+        <w:tc>
+          <w:tcPr>
+            <w:tcW w:type="dxa" w:w="2160"/>
+            <w:shd w:val="clear" w:color="auto" w:fill="F1F5F9"/>
+          </w:tcPr>
+          <w:p>
+            <w:r>
+              <w:rPr>
+                <w:b/>
+                <w:sz w:val="19"/>
+              </w:rPr>
+            </w:r>
+            <w:r>
+              <w:rPr>
+                <w:b/>
+                <w:sz w:val="19"/>
+              </w:rPr>
+              <w:t>Balanced</w:t>
+            </w:r>
+          </w:p>
+        </w:tc>
+      </w:tr>
+      <w:tr>
+        <w:tc>
+          <w:tcPr>
+            <w:tcW w:type="dxa" w:w="2160"/>
+          </w:tcPr>
+          <w:p>
+            <w:r>
+              <w:rPr>
+                <w:sz w:val="19"/>
+              </w:rPr>
+            </w:r>
+            <w:r>
+              <w:rPr>
+                <w:sz w:val="19"/>
+              </w:rPr>
+              <w:t>A7 opening capital</w:t>
+            </w:r>
+          </w:p>
+        </w:tc>
+        <w:tc>
+          <w:tcPr>
+            <w:tcW w:type="dxa" w:w="2160"/>
+          </w:tcPr>
+          <w:p>
+            <w:r>
+              <w:rPr>
+                <w:sz w:val="19"/>
+              </w:rPr>
+            </w:r>
+            <w:r>
+              <w:rPr>
+                <w:rFonts w:ascii="Consolas" w:hAnsi="Consolas"/>
+                <w:color w:val="1D4ED8"/>
+                <w:sz w:val="19"/>
+              </w:rPr>
+              <w:t>500,000.00</w:t>
+            </w:r>
+          </w:p>
+        </w:tc>
+        <w:tc>
+          <w:tcPr>
+            <w:tcW w:type="dxa" w:w="2160"/>
+          </w:tcPr>
+          <w:p>
+            <w:r>
+              <w:rPr>
+                <w:sz w:val="19"/>
+              </w:rPr>
+            </w:r>
+            <w:r>
+              <w:rPr>
+                <w:rFonts w:ascii="Consolas" w:hAnsi="Consolas"/>
+                <w:color w:val="1D4ED8"/>
+                <w:sz w:val="19"/>
+              </w:rPr>
+              <w:t>500,000.00</w:t>
+            </w:r>
+          </w:p>
+        </w:tc>
+        <w:tc>
+          <w:tcPr>
+            <w:tcW w:type="dxa" w:w="2160"/>
+          </w:tcPr>
+          <w:p>
+            <w:r>
+              <w:rPr>
+                <w:sz w:val="19"/>
+              </w:rPr>
+            </w:r>
+            <w:r>
+              <w:rPr>
+                <w:sz w:val="19"/>
+              </w:rPr>
+              <w:t>yes</w:t>
+            </w:r>
+          </w:p>
+        </w:tc>
+      </w:tr>
+      <w:tr>
+        <w:tc>
+          <w:tcPr>
+            <w:tcW w:type="dxa" w:w="2160"/>
+          </w:tcPr>
+          <w:p>
+            <w:r>
+              <w:rPr>
+                <w:sz w:val="19"/>
+              </w:rPr>
+            </w:r>
+            <w:r>
+              <w:rPr>
+                <w:sz w:val="19"/>
+              </w:rPr>
+              <w:t>A11 purchase</w:t>
+            </w:r>
+          </w:p>
+        </w:tc>
+        <w:tc>
+          <w:tcPr>
+            <w:tcW w:type="dxa" w:w="2160"/>
+          </w:tcPr>
+          <w:p>
+            <w:r>
+              <w:rPr>
+                <w:sz w:val="19"/>
+              </w:rPr>
+            </w:r>
+            <w:r>
+              <w:rPr>
+                <w:rFonts w:ascii="Consolas" w:hAnsi="Consolas"/>
+                <w:color w:val="1D4ED8"/>
+                <w:sz w:val="19"/>
+              </w:rPr>
+              <w:t>672,500.00</w:t>
+            </w:r>
+          </w:p>
+        </w:tc>
+        <w:tc>
+          <w:tcPr>
+            <w:tcW w:type="dxa" w:w="2160"/>
+          </w:tcPr>
+          <w:p>
+            <w:r>
+              <w:rPr>
+                <w:sz w:val="19"/>
+              </w:rPr>
+            </w:r>
+            <w:r>
+              <w:rPr>
+                <w:rFonts w:ascii="Consolas" w:hAnsi="Consolas"/>
+                <w:color w:val="1D4ED8"/>
+                <w:sz w:val="19"/>
+              </w:rPr>
+              <w:t>672,500.00</w:t>
+            </w:r>
+          </w:p>
+        </w:tc>
+        <w:tc>
+          <w:tcPr>
+            <w:tcW w:type="dxa" w:w="2160"/>
+          </w:tcPr>
+          <w:p>
+            <w:r>
+              <w:rPr>
+                <w:sz w:val="19"/>
+              </w:rPr>
+            </w:r>
+            <w:r>
+              <w:rPr>
+                <w:sz w:val="19"/>
+              </w:rPr>
+              <w:t>yes</w:t>
+            </w:r>
+          </w:p>
+        </w:tc>
+      </w:tr>
+      <w:tr>
+        <w:tc>
+          <w:tcPr>
+            <w:tcW w:type="dxa" w:w="2160"/>
+          </w:tcPr>
+          <w:p>
+            <w:r>
+              <w:rPr>
+                <w:sz w:val="19"/>
+              </w:rPr>
+            </w:r>
+            <w:r>
+              <w:rPr>
+                <w:sz w:val="19"/>
+              </w:rPr>
+              <w:t>A12 production</w:t>
+            </w:r>
+          </w:p>
+        </w:tc>
+        <w:tc>
+          <w:tcPr>
+            <w:tcW w:type="dxa" w:w="2160"/>
+          </w:tcPr>
+          <w:p>
+            <w:r>
+              <w:rPr>
+                <w:sz w:val="19"/>
+              </w:rPr>
+            </w:r>
+            <w:r>
+              <w:rPr>
+                <w:rFonts w:ascii="Consolas" w:hAnsi="Consolas"/>
+                <w:color w:val="1D4ED8"/>
+                <w:sz w:val="19"/>
+              </w:rPr>
+              <w:t>672,500.00</w:t>
+            </w:r>
+          </w:p>
+        </w:tc>
+        <w:tc>
+          <w:tcPr>
+            <w:tcW w:type="dxa" w:w="2160"/>
+          </w:tcPr>
+          <w:p>
+            <w:r>
+              <w:rPr>
+                <w:sz w:val="19"/>
+              </w:rPr>
+            </w:r>
+            <w:r>
+              <w:rPr>
+                <w:rFonts w:ascii="Consolas" w:hAnsi="Consolas"/>
+                <w:color w:val="1D4ED8"/>
+                <w:sz w:val="19"/>
+              </w:rPr>
+              <w:t>672,500.00</w:t>
+            </w:r>
+          </w:p>
+        </w:tc>
+        <w:tc>
+          <w:tcPr>
+            <w:tcW w:type="dxa" w:w="2160"/>
+          </w:tcPr>
+          <w:p>
+            <w:r>
+              <w:rPr>
+                <w:sz w:val="19"/>
+              </w:rPr>
+            </w:r>
+            <w:r>
+              <w:rPr>
+                <w:sz w:val="19"/>
+              </w:rPr>
+              <w:t>yes</w:t>
+            </w:r>
+          </w:p>
+        </w:tc>
+      </w:tr>
+      <w:tr>
+        <w:tc>
+          <w:tcPr>
+            <w:tcW w:type="dxa" w:w="2160"/>
+          </w:tcPr>
+          <w:p>
+            <w:r>
+              <w:rPr>
+                <w:sz w:val="19"/>
+              </w:rPr>
+            </w:r>
+            <w:r>
+              <w:rPr>
+                <w:sz w:val="19"/>
+              </w:rPr>
+              <w:t>A13 sale</w:t>
+            </w:r>
+          </w:p>
+        </w:tc>
+        <w:tc>
+          <w:tcPr>
+            <w:tcW w:type="dxa" w:w="2160"/>
+          </w:tcPr>
+          <w:p>
+            <w:r>
+              <w:rPr>
+                <w:sz w:val="19"/>
+              </w:rPr>
+            </w:r>
+            <w:r>
+              <w:rPr>
+                <w:rFonts w:ascii="Consolas" w:hAnsi="Consolas"/>
+                <w:color w:val="1D4ED8"/>
+                <w:sz w:val="19"/>
+              </w:rPr>
+              <w:t>683,750.00</w:t>
+            </w:r>
+          </w:p>
+        </w:tc>
+        <w:tc>
+          <w:tcPr>
+            <w:tcW w:type="dxa" w:w="2160"/>
+          </w:tcPr>
+          <w:p>
+            <w:r>
+              <w:rPr>
+                <w:sz w:val="19"/>
+              </w:rPr>
+            </w:r>
+            <w:r>
+              <w:rPr>
+                <w:rFonts w:ascii="Consolas" w:hAnsi="Consolas"/>
+                <w:color w:val="1D4ED8"/>
+                <w:sz w:val="19"/>
+              </w:rPr>
+              <w:t>683,750.00</w:t>
+            </w:r>
+          </w:p>
+        </w:tc>
+        <w:tc>
+          <w:tcPr>
+            <w:tcW w:type="dxa" w:w="2160"/>
+          </w:tcPr>
+          <w:p>
+            <w:r>
+              <w:rPr>
+                <w:sz w:val="19"/>
+              </w:rPr>
+            </w:r>
+            <w:r>
+              <w:rPr>
+                <w:sz w:val="19"/>
+              </w:rPr>
+              <w:t>yes</w:t>
+            </w:r>
+          </w:p>
+        </w:tc>
+      </w:tr>
+      <w:tr>
+        <w:tc>
+          <w:tcPr>
+            <w:tcW w:type="dxa" w:w="2160"/>
+          </w:tcPr>
+          <w:p>
+            <w:r>
+              <w:rPr>
+                <w:sz w:val="19"/>
+              </w:rPr>
+            </w:r>
+            <w:r>
+              <w:rPr>
+                <w:sz w:val="19"/>
+              </w:rPr>
+              <w:t>A14 receipt</w:t>
+            </w:r>
+          </w:p>
+        </w:tc>
+        <w:tc>
+          <w:tcPr>
+            <w:tcW w:type="dxa" w:w="2160"/>
+          </w:tcPr>
+          <w:p>
+            <w:r>
+              <w:rPr>
+                <w:sz w:val="19"/>
+              </w:rPr>
+            </w:r>
+            <w:r>
+              <w:rPr>
+                <w:rFonts w:ascii="Consolas" w:hAnsi="Consolas"/>
+                <w:color w:val="1D4ED8"/>
+                <w:sz w:val="19"/>
+              </w:rPr>
+              <w:t>683,750.00</w:t>
+            </w:r>
+          </w:p>
+        </w:tc>
+        <w:tc>
+          <w:tcPr>
+            <w:tcW w:type="dxa" w:w="2160"/>
+          </w:tcPr>
+          <w:p>
+            <w:r>
+              <w:rPr>
+                <w:sz w:val="19"/>
+              </w:rPr>
+            </w:r>
+            <w:r>
+              <w:rPr>
+                <w:rFonts w:ascii="Consolas" w:hAnsi="Consolas"/>
+                <w:color w:val="1D4ED8"/>
+                <w:sz w:val="19"/>
+              </w:rPr>
+              <w:t>683,750.00</w:t>
+            </w:r>
+          </w:p>
+        </w:tc>
+        <w:tc>
+          <w:tcPr>
+            <w:tcW w:type="dxa" w:w="2160"/>
+          </w:tcPr>
+          <w:p>
+            <w:r>
+              <w:rPr>
+                <w:sz w:val="19"/>
+              </w:rPr>
+            </w:r>
+            <w:r>
+              <w:rPr>
+                <w:sz w:val="19"/>
+              </w:rPr>
+              <w:t>yes</w:t>
+            </w:r>
+          </w:p>
+        </w:tc>
+      </w:tr>
+      <w:tr>
+        <w:tc>
+          <w:tcPr>
+            <w:tcW w:type="dxa" w:w="2160"/>
+          </w:tcPr>
+          <w:p>
+            <w:r>
+              <w:rPr>
+                <w:sz w:val="19"/>
+              </w:rPr>
+            </w:r>
+            <w:r>
+              <w:rPr>
+                <w:sz w:val="19"/>
+              </w:rPr>
+              <w:t>A15 supplier paid</w:t>
+            </w:r>
+          </w:p>
+        </w:tc>
+        <w:tc>
+          <w:tcPr>
+            <w:tcW w:type="dxa" w:w="2160"/>
+          </w:tcPr>
+          <w:p>
+            <w:r>
+              <w:rPr>
+                <w:sz w:val="19"/>
+              </w:rPr>
+            </w:r>
+            <w:r>
+              <w:rPr>
+                <w:rFonts w:ascii="Consolas" w:hAnsi="Consolas"/>
+                <w:color w:val="1D4ED8"/>
+                <w:sz w:val="19"/>
+              </w:rPr>
+              <w:t>511,250.00</w:t>
+            </w:r>
+          </w:p>
+        </w:tc>
+        <w:tc>
+          <w:tcPr>
+            <w:tcW w:type="dxa" w:w="2160"/>
+          </w:tcPr>
+          <w:p>
+            <w:r>
+              <w:rPr>
+                <w:sz w:val="19"/>
+              </w:rPr>
+            </w:r>
+            <w:r>
+              <w:rPr>
+                <w:rFonts w:ascii="Consolas" w:hAnsi="Consolas"/>
+                <w:color w:val="1D4ED8"/>
+                <w:sz w:val="19"/>
+              </w:rPr>
+              <w:t>511,250.00</w:t>
+            </w:r>
+          </w:p>
+        </w:tc>
+        <w:tc>
+          <w:tcPr>
+            <w:tcW w:type="dxa" w:w="2160"/>
+          </w:tcPr>
+          <w:p>
+            <w:r>
+              <w:rPr>
+                <w:sz w:val="19"/>
+              </w:rPr>
+            </w:r>
+            <w:r>
+              <w:rPr>
+                <w:sz w:val="19"/>
+              </w:rPr>
+              <w:t>yes</w:t>
+            </w:r>
+          </w:p>
+        </w:tc>
+      </w:tr>
+      <w:tr>
+        <w:tc>
+          <w:tcPr>
+            <w:tcW w:type="dxa" w:w="2160"/>
+          </w:tcPr>
+          <w:p>
+            <w:r>
+              <w:rPr>
+                <w:sz w:val="19"/>
+              </w:rPr>
+            </w:r>
+            <w:r>
+              <w:rPr>
+                <w:sz w:val="19"/>
+              </w:rPr>
+              <w:t>A17 payroll (optional)</w:t>
+            </w:r>
+          </w:p>
+        </w:tc>
+        <w:tc>
+          <w:tcPr>
+            <w:tcW w:type="dxa" w:w="2160"/>
+          </w:tcPr>
+          <w:p>
+            <w:r>
+              <w:rPr>
+                <w:sz w:val="19"/>
+              </w:rPr>
+            </w:r>
+            <w:r>
+              <w:rPr>
+                <w:rFonts w:ascii="Consolas" w:hAnsi="Consolas"/>
+                <w:color w:val="1D4ED8"/>
+                <w:sz w:val="19"/>
+              </w:rPr>
+              <w:t>484,250.00</w:t>
+            </w:r>
+          </w:p>
+        </w:tc>
+        <w:tc>
+          <w:tcPr>
+            <w:tcW w:type="dxa" w:w="2160"/>
+          </w:tcPr>
+          <w:p>
+            <w:r>
+              <w:rPr>
+                <w:sz w:val="19"/>
+              </w:rPr>
+            </w:r>
+            <w:r>
+              <w:rPr>
+                <w:rFonts w:ascii="Consolas" w:hAnsi="Consolas"/>
+                <w:color w:val="1D4ED8"/>
+                <w:sz w:val="19"/>
+              </w:rPr>
+              <w:t>484,250.00</w:t>
+            </w:r>
+          </w:p>
+        </w:tc>
+        <w:tc>
+          <w:tcPr>
+            <w:tcW w:type="dxa" w:w="2160"/>
+          </w:tcPr>
+          <w:p>
+            <w:r>
+              <w:rPr>
+                <w:sz w:val="19"/>
+              </w:rPr>
+            </w:r>
+            <w:r>
+              <w:rPr>
+                <w:sz w:val="19"/>
+              </w:rPr>
+              <w:t>yes</w:t>
+            </w:r>
+          </w:p>
+        </w:tc>
+      </w:tr>
+    </w:tbl>
+    <w:p/>
+    <w:p>
+      <w:r>
+        <w:rPr>
+          <w:b/>
+        </w:rPr>
+        <w:t>The final position:</w:t>
       </w:r>
     </w:p>
     <w:tbl>

</xml_diff>